<commit_message>
Publish master monograph suites (5D Mind Model + 4 Core Monographs), CC BY-NC-SA 4.0 / MIT license, and archive older drafts
</commit_message>
<xml_diff>
--- a/docs/Value_Chain_Physics_Non_IID_OCGS_JSSC.docx
+++ b/docs/Value_Chain_Physics_Non_IID_OCGS_JSSC.docx
@@ -15,9 +15,9 @@
       <w:pPr>
         <w:pStyle w:val="3"/>
       </w:pPr>
-      <w:bookmarkStart w:id="1" w:name="X443958f676e43a54fb8992415e30613c6775f61"/>
-      <w:r>
-        <w:t>From 100-Billion Industrial Closed-Loop Proofs to First-Principle Elevation of Complexity Science</w:t>
+      <w:bookmarkStart w:id="1" w:name="X3e8882aa16ec8e586f2f291da05613e503f95b4"/>
+      <w:r>
+        <w:t>From 100-Billion Enterprise Industrial Kinetic Work Closed-Loop Empirical Proofs to First-Principle Elevation of Complexity Science</w:t>
       </w:r>
     </w:p>
     <w:p>
@@ -29,31 +29,7 @@
           <w:b/>
           <w:bCs/>
         </w:rPr>
-        <w:t xml:space="preserve">Grit Meng </w:t>
-      </w:r>
-      <w:r>
-        <w:rPr>
-          <w:rFonts w:hint="eastAsia"/>
-          <w:b/>
-          <w:bCs/>
-        </w:rPr>
-        <w:t>(</w:t>
-      </w:r>
-      <w:r>
-        <w:rPr>
-          <w:rFonts w:hint="eastAsia"/>
-          <w:b/>
-          <w:bCs/>
-        </w:rPr>
-        <w:t>孟凡淳</w:t>
-      </w:r>
-      <w:r>
-        <w:rPr>
-          <w:rFonts w:hint="eastAsia"/>
-          <w:b/>
-          <w:bCs/>
-        </w:rPr>
-        <w:t>)</w:t>
+        <w:t>Grit Meng</w:t>
       </w:r>
       <w:r>
         <w:br/>
@@ -66,7 +42,7 @@
     </w:p>
     <w:p>
       <w:r>
-        <w:pict w14:anchorId="5DF1A91A">
+        <w:pict w14:anchorId="19006686">
           <v:rect id="_x0000_i1025" style="width:0;height:1.5pt" o:hralign="center" o:hrstd="t" o:hr="t"/>
         </w:pict>
       </w:r>
@@ -299,7 +275,7 @@
     </w:p>
     <w:p>
       <w:r>
-        <w:pict w14:anchorId="1AF13BD0">
+        <w:pict w14:anchorId="3F69E1C5">
           <v:rect id="_x0000_i1026" style="width:0;height:1.5pt" o:hralign="center" o:hrstd="t" o:hr="t"/>
         </w:pict>
       </w:r>
@@ -336,10 +312,7 @@
         <w:pStyle w:val="FirstParagraph"/>
       </w:pPr>
       <w:r>
-        <w:t>Qian et al. (1990) defined man-made and natural systems featuring massive elements, multi-level structures, long-range non-linear interactions, and continuous exchange of matter, energy, and information with the environment as Open Complex Giant Systems (OCGS). Qian proposed the “Hall for Workshop of Metasynthetic Engineering (HWME, also widely referred to as Hall of Workshop for Decision Support, HWDS)”, emphasizing the systems engineering philosophy of “Metasynthetic Departments” and “Human-Machine Combin</w:t>
-      </w:r>
-      <w:r>
-        <w:t>ation.”</w:t>
+        <w:t>Qian et al. (1990) defined man-made and natural systems featuring massive elements, multi-level structures, long-range non-linear interactions, and continuous exchange of matter, energy, and information with the environment as Open Complex Giant Systems (OCGS). Qian proposed the “Hall for Workshop of Metasynthetic Engineering (HWME) from qualitative to quantitative”, emphasizing the systems engineering philosophy of “Overall Design Department” and “Human-Machine Combination.”</w:t>
       </w:r>
     </w:p>
     <w:p>
@@ -466,7 +439,7 @@
       <m:oMath>
         <m:r>
           <m:rPr>
-            <m:sty m:val="b"/>
+            <m:sty m:val="p"/>
           </m:rPr>
           <w:rPr>
             <w:rFonts w:ascii="Cambria Math" w:hAnsi="Cambria Math"/>
@@ -489,7 +462,7 @@
           <m:e>
             <m:r>
               <m:rPr>
-                <m:sty m:val="b"/>
+                <m:sty m:val="p"/>
               </m:rPr>
               <w:rPr>
                 <w:rFonts w:ascii="Cambria Math" w:hAnsi="Cambria Math"/>
@@ -636,9 +609,6 @@
           </m:sSubPr>
           <m:e>
             <m:r>
-              <m:rPr>
-                <m:sty m:val="bi"/>
-              </m:rPr>
               <w:rPr>
                 <w:rFonts w:ascii="Cambria Math" w:hAnsi="Cambria Math"/>
               </w:rPr>
@@ -648,11 +618,8 @@
           <m:sub>
             <m:r>
               <m:rPr>
-                <m:sty m:val="p"/>
-              </m:rPr>
-              <w:rPr>
-                <w:rFonts w:ascii="Cambria Math" w:hAnsi="Cambria Math"/>
-              </w:rPr>
+                <m:nor/>
+              </m:rPr>
               <m:t>supp</m:t>
             </m:r>
           </m:sub>
@@ -731,7 +698,10 @@
         </m:sSub>
       </m:oMath>
       <w:r>
-        <w:t xml:space="preserve"> to be no less than the controlled system’s variety </w:t>
+        <w:t xml:space="preserve"> </w:t>
+      </w:r>
+      <w:r>
+        <w:t xml:space="preserve">to be no less than the controlled system’s variety </w:t>
       </w:r>
       <m:oMath>
         <m:sSub>
@@ -856,7 +826,7 @@
     </w:p>
     <w:p>
       <w:r>
-        <w:pict w14:anchorId="33906D96">
+        <w:pict w14:anchorId="5C071A28">
           <v:rect id="_x0000_i1027" style="width:0;height:1.5pt" o:hralign="center" o:hrstd="t" o:hr="t"/>
         </w:pict>
       </w:r>
@@ -910,16 +880,35 @@
           <m:jc m:val="center"/>
         </m:oMathParaPr>
         <m:oMath>
-          <m:r>
-            <m:rPr>
-              <m:scr m:val="script"/>
-              <m:sty m:val="p"/>
-            </m:rPr>
-            <w:rPr>
-              <w:rFonts w:ascii="Cambria Math" w:hAnsi="Cambria Math"/>
-            </w:rPr>
-            <m:t>M</m:t>
-          </m:r>
+          <m:sSub>
+            <m:sSubPr>
+              <m:ctrlPr>
+                <w:rPr>
+                  <w:rFonts w:ascii="Cambria Math" w:hAnsi="Cambria Math"/>
+                </w:rPr>
+              </m:ctrlPr>
+            </m:sSubPr>
+            <m:e>
+              <m:r>
+                <m:rPr>
+                  <m:scr m:val="script"/>
+                  <m:sty m:val="p"/>
+                </m:rPr>
+                <w:rPr>
+                  <w:rFonts w:ascii="Cambria Math" w:hAnsi="Cambria Math"/>
+                </w:rPr>
+                <m:t>M</m:t>
+              </m:r>
+            </m:e>
+            <m:sub>
+              <m:r>
+                <m:rPr>
+                  <m:nor/>
+                </m:rPr>
+                <m:t>model</m:t>
+              </m:r>
+            </m:sub>
+          </m:sSub>
           <m:r>
             <m:rPr>
               <m:sty m:val="p"/>
@@ -927,22 +916,7 @@
             <w:rPr>
               <w:rFonts w:ascii="Cambria Math" w:hAnsi="Cambria Math"/>
             </w:rPr>
-            <m:t>(</m:t>
-          </m:r>
-          <m:r>
-            <w:rPr>
-              <w:rFonts w:ascii="Cambria Math" w:hAnsi="Cambria Math"/>
-            </w:rPr>
-            <m:t>t</m:t>
-          </m:r>
-          <m:r>
-            <m:rPr>
-              <m:sty m:val="p"/>
-            </m:rPr>
-            <w:rPr>
-              <w:rFonts w:ascii="Cambria Math" w:hAnsi="Cambria Math"/>
-            </w:rPr>
-            <m:t>)=</m:t>
+            <m:t>=</m:t>
           </m:r>
           <m:r>
             <m:rPr>
@@ -1011,37 +985,10 @@
             <m:t>,</m:t>
           </m:r>
           <m:r>
-            <m:rPr>
-              <m:sty m:val="bi"/>
-            </m:rPr>
             <w:rPr>
               <w:rFonts w:ascii="Cambria Math" w:hAnsi="Cambria Math"/>
             </w:rPr>
-            <m:t>x</m:t>
-          </m:r>
-          <m:r>
-            <m:rPr>
-              <m:sty m:val="p"/>
-            </m:rPr>
-            <w:rPr>
-              <w:rFonts w:ascii="Cambria Math" w:hAnsi="Cambria Math"/>
-            </w:rPr>
-            <m:t>(</m:t>
-          </m:r>
-          <m:r>
-            <w:rPr>
-              <w:rFonts w:ascii="Cambria Math" w:hAnsi="Cambria Math"/>
-            </w:rPr>
-            <m:t>t</m:t>
-          </m:r>
-          <m:r>
-            <m:rPr>
-              <m:sty m:val="p"/>
-            </m:rPr>
-            <w:rPr>
-              <w:rFonts w:ascii="Cambria Math" w:hAnsi="Cambria Math"/>
-            </w:rPr>
-            <m:t>)</m:t>
+            <m:t>X</m:t>
           </m:r>
           <m:r>
             <m:rPr>
@@ -1053,37 +1000,10 @@
             <m:t>,Δ</m:t>
           </m:r>
           <m:r>
-            <m:rPr>
-              <m:sty m:val="bi"/>
-            </m:rPr>
             <w:rPr>
               <w:rFonts w:ascii="Cambria Math" w:hAnsi="Cambria Math"/>
             </w:rPr>
-            <m:t>x</m:t>
-          </m:r>
-          <m:r>
-            <m:rPr>
-              <m:sty m:val="p"/>
-            </m:rPr>
-            <w:rPr>
-              <w:rFonts w:ascii="Cambria Math" w:hAnsi="Cambria Math"/>
-            </w:rPr>
-            <m:t>(</m:t>
-          </m:r>
-          <m:r>
-            <w:rPr>
-              <w:rFonts w:ascii="Cambria Math" w:hAnsi="Cambria Math"/>
-            </w:rPr>
-            <m:t>t</m:t>
-          </m:r>
-          <m:r>
-            <m:rPr>
-              <m:sty m:val="p"/>
-            </m:rPr>
-            <w:rPr>
-              <w:rFonts w:ascii="Cambria Math" w:hAnsi="Cambria Math"/>
-            </w:rPr>
-            <m:t>)</m:t>
+            <m:t>X</m:t>
           </m:r>
           <m:r>
             <m:rPr>
@@ -1226,7 +1146,7 @@
           <m:e>
             <m:r>
               <m:rPr>
-                <m:sty m:val="b"/>
+                <m:sty m:val="p"/>
               </m:rPr>
               <w:rPr>
                 <w:rFonts w:ascii="Cambria Math" w:hAnsi="Cambria Math"/>
@@ -1261,13 +1181,10 @@
       </w:pPr>
       <m:oMath>
         <m:r>
-          <m:rPr>
-            <m:sty m:val="bi"/>
-          </m:rPr>
-          <w:rPr>
-            <w:rFonts w:ascii="Cambria Math" w:hAnsi="Cambria Math"/>
-          </w:rPr>
-          <m:t>x</m:t>
+          <w:rPr>
+            <w:rFonts w:ascii="Cambria Math" w:hAnsi="Cambria Math"/>
+          </w:rPr>
+          <m:t>X</m:t>
         </m:r>
         <m:r>
           <m:rPr>
@@ -1306,13 +1223,10 @@
       </w:r>
       <m:oMath>
         <m:r>
-          <m:rPr>
-            <m:sty m:val="bi"/>
-          </m:rPr>
-          <w:rPr>
-            <w:rFonts w:ascii="Cambria Math" w:hAnsi="Cambria Math"/>
-          </w:rPr>
-          <m:t>x</m:t>
+          <w:rPr>
+            <w:rFonts w:ascii="Cambria Math" w:hAnsi="Cambria Math"/>
+          </w:rPr>
+          <m:t>X</m:t>
         </m:r>
         <m:r>
           <m:rPr>
@@ -1376,13 +1290,10 @@
           <m:t>Δ</m:t>
         </m:r>
         <m:r>
-          <m:rPr>
-            <m:sty m:val="bi"/>
-          </m:rPr>
-          <w:rPr>
-            <w:rFonts w:ascii="Cambria Math" w:hAnsi="Cambria Math"/>
-          </w:rPr>
-          <m:t>x</m:t>
+          <w:rPr>
+            <w:rFonts w:ascii="Cambria Math" w:hAnsi="Cambria Math"/>
+          </w:rPr>
+          <m:t>X</m:t>
         </m:r>
         <m:r>
           <m:rPr>
@@ -1422,21 +1333,12 @@
       <m:oMath>
         <m:r>
           <m:rPr>
-            <m:sty m:val="b"/>
-          </m:rPr>
-          <w:rPr>
-            <w:rFonts w:ascii="Cambria Math" w:hAnsi="Cambria Math"/>
-          </w:rPr>
-          <m:t>Δ</m:t>
-        </m:r>
-        <m:r>
-          <m:rPr>
-            <m:sty m:val="p"/>
-          </m:rPr>
-          <w:rPr>
-            <w:rFonts w:ascii="Cambria Math" w:hAnsi="Cambria Math"/>
-          </w:rPr>
-          <m:t>=</m:t>
+            <m:sty m:val="p"/>
+          </m:rPr>
+          <w:rPr>
+            <w:rFonts w:ascii="Cambria Math" w:hAnsi="Cambria Math"/>
+          </w:rPr>
+          <m:t>Δ=</m:t>
         </m:r>
         <m:sSub>
           <m:sSubPr>
@@ -1448,23 +1350,17 @@
           </m:sSubPr>
           <m:e>
             <m:r>
-              <m:rPr>
-                <m:sty m:val="bi"/>
-              </m:rPr>
-              <w:rPr>
-                <w:rFonts w:ascii="Cambria Math" w:hAnsi="Cambria Math"/>
-              </w:rPr>
-              <m:t>x</m:t>
+              <w:rPr>
+                <w:rFonts w:ascii="Cambria Math" w:hAnsi="Cambria Math"/>
+              </w:rPr>
+              <m:t>X</m:t>
             </m:r>
           </m:e>
           <m:sub>
             <m:r>
               <m:rPr>
-                <m:sty m:val="p"/>
-              </m:rPr>
-              <w:rPr>
-                <w:rFonts w:ascii="Cambria Math" w:hAnsi="Cambria Math"/>
-              </w:rPr>
+                <m:nor/>
+              </m:rPr>
               <m:t>real</m:t>
             </m:r>
           </m:sub>
@@ -1503,23 +1399,17 @@
           </m:sSubPr>
           <m:e>
             <m:r>
-              <m:rPr>
-                <m:sty m:val="bi"/>
-              </m:rPr>
-              <w:rPr>
-                <w:rFonts w:ascii="Cambria Math" w:hAnsi="Cambria Math"/>
-              </w:rPr>
-              <m:t>x</m:t>
+              <w:rPr>
+                <w:rFonts w:ascii="Cambria Math" w:hAnsi="Cambria Math"/>
+              </w:rPr>
+              <m:t>X</m:t>
             </m:r>
           </m:e>
           <m:sub>
             <m:r>
               <m:rPr>
-                <m:sty m:val="p"/>
-              </m:rPr>
-              <w:rPr>
-                <w:rFonts w:ascii="Cambria Math" w:hAnsi="Cambria Math"/>
-              </w:rPr>
+                <m:nor/>
+              </m:rPr>
               <m:t>target</m:t>
             </m:r>
           </m:sub>
@@ -1566,7 +1456,7 @@
       <m:oMath>
         <m:r>
           <m:rPr>
-            <m:sty m:val="b"/>
+            <m:sty m:val="p"/>
           </m:rPr>
           <w:rPr>
             <w:rFonts w:ascii="Cambria Math" w:hAnsi="Cambria Math"/>
@@ -1589,7 +1479,7 @@
           <m:e>
             <m:r>
               <m:rPr>
-                <m:sty m:val="b"/>
+                <m:sty m:val="p"/>
               </m:rPr>
               <w:rPr>
                 <w:rFonts w:ascii="Cambria Math" w:hAnsi="Cambria Math"/>
@@ -1659,7 +1549,7 @@
           <w:b/>
           <w:bCs/>
         </w:rPr>
-        <w:t>[Causal Anchoring and Dual Decision Box]</w:t>
+        <w:t>[Causal Anchoring and Dual-Duality Decision Practice in Action]</w:t>
       </w:r>
     </w:p>
     <w:p>
@@ -1682,9 +1572,6 @@
       </w:r>
       <m:oMath>
         <m:r>
-          <m:rPr>
-            <m:sty m:val="bi"/>
-          </m:rPr>
           <w:rPr>
             <w:rFonts w:ascii="Cambria Math" w:hAnsi="Cambria Math"/>
           </w:rPr>
@@ -1705,9 +1592,6 @@
           <m:t>Δ</m:t>
         </m:r>
         <m:r>
-          <m:rPr>
-            <m:sty m:val="bi"/>
-          </m:rPr>
           <w:rPr>
             <w:rFonts w:ascii="Cambria Math" w:hAnsi="Cambria Math"/>
           </w:rPr>
@@ -1820,18 +1704,40 @@
         </m:r>
       </m:oMath>
       <w:r>
-        <w:t xml:space="preserve"> activate 2nd-order self-reflection operator </w:t>
-      </w:r>
-      <m:oMath>
-        <m:r>
-          <m:rPr>
-            <m:sty m:val="b"/>
-          </m:rPr>
-          <w:rPr>
-            <w:rFonts w:ascii="Cambria Math" w:hAnsi="Cambria Math"/>
-          </w:rPr>
-          <m:t>Φ</m:t>
-        </m:r>
+        <w:t xml:space="preserve"> activate Second-Order Meta-Cognitive Constitutional Rewriting Operator </w:t>
+      </w:r>
+      <m:oMath>
+        <m:sSub>
+          <m:sSubPr>
+            <m:ctrlPr>
+              <w:rPr>
+                <w:rFonts w:ascii="Cambria Math" w:hAnsi="Cambria Math"/>
+              </w:rPr>
+            </m:ctrlPr>
+          </m:sSubPr>
+          <m:e>
+            <m:r>
+              <m:rPr>
+                <m:sty m:val="p"/>
+              </m:rPr>
+              <w:rPr>
+                <w:rFonts w:ascii="Cambria Math" w:hAnsi="Cambria Math"/>
+              </w:rPr>
+              <m:t>Φ</m:t>
+            </m:r>
+          </m:e>
+          <m:sub>
+            <m:r>
+              <m:rPr>
+                <m:sty m:val="p"/>
+              </m:rPr>
+              <w:rPr>
+                <w:rFonts w:ascii="Cambria Math" w:hAnsi="Cambria Math"/>
+              </w:rPr>
+              <m:t>Human</m:t>
+            </m:r>
+          </m:sub>
+        </m:sSub>
       </m:oMath>
       <w:r>
         <w:t xml:space="preserve"> to reconstruct network topologies!</w:t>
@@ -2016,7 +1922,7 @@
           <m:e>
             <m:r>
               <m:rPr>
-                <m:sty m:val="b"/>
+                <m:sty m:val="p"/>
               </m:rPr>
               <w:rPr>
                 <w:rFonts w:ascii="Cambria Math" w:hAnsi="Cambria Math"/>
@@ -2203,13 +2109,10 @@
           </m:sSubPr>
           <m:e>
             <m:r>
-              <m:rPr>
-                <m:sty m:val="bi"/>
-              </m:rPr>
-              <w:rPr>
-                <w:rFonts w:ascii="Cambria Math" w:hAnsi="Cambria Math"/>
-              </w:rPr>
-              <m:t>x</m:t>
+              <w:rPr>
+                <w:rFonts w:ascii="Cambria Math" w:hAnsi="Cambria Math"/>
+              </w:rPr>
+              <m:t>X</m:t>
             </m:r>
           </m:e>
           <m:sub>
@@ -2339,8 +2242,7 @@
           <w:b/>
           <w:bCs/>
         </w:rPr>
-        <w:lastRenderedPageBreak/>
-        <w:t>Principle 8 Evolutionary (Second-Order Meta-Cognitive Principle)</w:t>
+        <w:t>Principle 8 Evolutionary (Second-Order Meta-Cognitive Constitutional Rewriting Principle)</w:t>
       </w:r>
       <w:r>
         <w:t xml:space="preserve">: Normal operations self-heal autonomously via silicon out-of-the-loop; when residuals breach thresholds </w:t>
@@ -2348,21 +2250,12 @@
       <m:oMath>
         <m:r>
           <m:rPr>
-            <m:sty m:val="b"/>
-          </m:rPr>
-          <w:rPr>
-            <w:rFonts w:ascii="Cambria Math" w:hAnsi="Cambria Math"/>
-          </w:rPr>
-          <m:t>Δ</m:t>
-        </m:r>
-        <m:r>
-          <m:rPr>
-            <m:sty m:val="p"/>
-          </m:rPr>
-          <w:rPr>
-            <w:rFonts w:ascii="Cambria Math" w:hAnsi="Cambria Math"/>
-          </w:rPr>
-          <m:t>&gt;</m:t>
+            <m:sty m:val="p"/>
+          </m:rPr>
+          <w:rPr>
+            <w:rFonts w:ascii="Cambria Math" w:hAnsi="Cambria Math"/>
+          </w:rPr>
+          <m:t>Δ&gt;</m:t>
         </m:r>
         <m:sSub>
           <m:sSubPr>
@@ -2394,7 +2287,7 @@
         </m:sSub>
       </m:oMath>
       <w:r>
-        <w:t xml:space="preserve"> triggering phase deadlocks, human experts introduce the second-order meta-control operator </w:t>
+        <w:t xml:space="preserve"> triggering phase deadlocks, human experts introduce the Second-Order Meta-Cognitive Constitutional Rewriting Operator </w:t>
       </w:r>
       <m:oMath>
         <m:sSub>
@@ -2408,7 +2301,7 @@
           <m:e>
             <m:r>
               <m:rPr>
-                <m:sty m:val="b"/>
+                <m:sty m:val="p"/>
               </m:rPr>
               <w:rPr>
                 <w:rFonts w:ascii="Cambria Math" w:hAnsi="Cambria Math"/>
@@ -2430,26 +2323,17 @@
         </m:sSub>
       </m:oMath>
       <w:r>
-        <w:t xml:space="preserve"> (Higher-order Meta-heuristic Operator, corresponding to high-level prefrontal self-reflection in cognitive science) to rewrite axiomatic bases (</w:t>
-      </w:r>
-      <m:oMath>
-        <m:r>
-          <m:rPr>
-            <m:sty m:val="b"/>
-          </m:rPr>
-          <w:rPr>
-            <w:rFonts w:ascii="Cambria Math" w:hAnsi="Cambria Math"/>
-          </w:rPr>
-          <m:t>Φ</m:t>
-        </m:r>
-        <m:r>
-          <m:rPr>
-            <m:sty m:val="p"/>
-          </m:rPr>
-          <w:rPr>
-            <w:rFonts w:ascii="Cambria Math" w:hAnsi="Cambria Math"/>
-          </w:rPr>
-          <m:t>:</m:t>
+        <w:t xml:space="preserve"> (Meta-cognitive Constitutional Rewriting Operator, corresponding to high-level prefrontal self-reflection in cognitive science) to rewrite axiomatic bases (</w:t>
+      </w:r>
+      <m:oMath>
+        <m:r>
+          <m:rPr>
+            <m:sty m:val="p"/>
+          </m:rPr>
+          <w:rPr>
+            <w:rFonts w:ascii="Cambria Math" w:hAnsi="Cambria Math"/>
+          </w:rPr>
+          <m:t>Φ:</m:t>
         </m:r>
         <m:sSub>
           <m:sSubPr>
@@ -2462,7 +2346,7 @@
           <m:e>
             <m:r>
               <m:rPr>
-                <m:sty m:val="b"/>
+                <m:sty m:val="p"/>
               </m:rPr>
               <w:rPr>
                 <w:rFonts w:ascii="Cambria Math" w:hAnsi="Cambria Math"/>
@@ -2499,7 +2383,7 @@
           <m:e>
             <m:r>
               <m:rPr>
-                <m:sty m:val="b"/>
+                <m:sty m:val="p"/>
               </m:rPr>
               <w:rPr>
                 <w:rFonts w:ascii="Cambria Math" w:hAnsi="Cambria Math"/>
@@ -2538,7 +2422,7 @@
     </w:p>
     <w:p>
       <w:r>
-        <w:pict w14:anchorId="46C8D0DC">
+        <w:pict w14:anchorId="17835756">
           <v:rect id="_x0000_i1028" style="width:0;height:1.5pt" o:hralign="center" o:hrstd="t" o:hr="t"/>
         </w:pict>
       </w:r>
@@ -2652,13 +2536,10 @@
               </m:sSubPr>
               <m:e>
                 <m:r>
-                  <m:rPr>
-                    <m:sty m:val="bi"/>
-                  </m:rPr>
                   <w:rPr>
                     <w:rFonts w:ascii="Cambria Math" w:hAnsi="Cambria Math"/>
                   </w:rPr>
-                  <m:t>x</m:t>
+                  <m:t>X</m:t>
                 </m:r>
               </m:e>
               <m:sub>
@@ -3184,10 +3065,7 @@
         </m:sSub>
       </m:oMath>
       <w:r>
-        <w:t xml:space="preserve"> </w:t>
-      </w:r>
-      <w:r>
-        <w:t xml:space="preserve">manifests as non-orthogonal control vector interference; operationally, this difference translates directly into extended Work-In-Progress (WIP) durations and increased idle man-hours; financially, it causes Cost of Goods Sold (COGS) to rise and Net Working Capital (NWC) to be trapped, reducing NOPAT, inflating Invested Capital, and driving ROIC downward. When mismatch angle </w:t>
+        <w:t xml:space="preserve"> manifests as non-orthogonal control vector interference; operationally, this difference translates directly into extended Work-In-Progress (WIP) durations and increased idle man-hours; financially, it causes Cost of Goods Sold (COGS) to rise and Net Working Capital (NWC) to be trapped, reducing NOPAT, inflating Invested Capital, and driving ROIC downward. When mismatch angle </w:t>
       </w:r>
       <m:oMath>
         <m:r>
@@ -3389,6 +3267,7 @@
       <w:bookmarkStart w:id="12" w:name="X929d4cda3eedaf2f625314d329566bab37dfefd"/>
       <w:bookmarkEnd w:id="11"/>
       <w:r>
+        <w:lastRenderedPageBreak/>
         <w:t>4.2 Theorem 2: 5D Dual-Helix Algebraic Pruning and Complexity Convergence</w:t>
       </w:r>
     </w:p>
@@ -3421,7 +3300,7 @@
           <m:e>
             <m:r>
               <m:rPr>
-                <m:sty m:val="b"/>
+                <m:sty m:val="p"/>
               </m:rPr>
               <w:rPr>
                 <w:rFonts w:ascii="Cambria Math" w:hAnsi="Cambria Math"/>
@@ -3452,7 +3331,8 @@
         </m:r>
         <m:r>
           <m:rPr>
-            <m:sty m:val="bi"/>
+            <m:scr m:val="script"/>
+            <m:sty m:val="p"/>
           </m:rPr>
           <w:rPr>
             <w:rFonts w:ascii="Cambria Math" w:hAnsi="Cambria Math"/>
@@ -3470,7 +3350,8 @@
         </m:r>
         <m:r>
           <m:rPr>
-            <m:sty m:val="bi"/>
+            <m:scr m:val="script"/>
+            <m:sty m:val="p"/>
           </m:rPr>
           <w:rPr>
             <w:rFonts w:ascii="Cambria Math" w:hAnsi="Cambria Math"/>
@@ -3488,7 +3369,8 @@
         </m:r>
         <m:r>
           <m:rPr>
-            <m:sty m:val="bi"/>
+            <m:scr m:val="script"/>
+            <m:sty m:val="p"/>
           </m:rPr>
           <w:rPr>
             <w:rFonts w:ascii="Cambria Math" w:hAnsi="Cambria Math"/>
@@ -3510,13 +3392,10 @@
       </w:r>
       <m:oMath>
         <m:r>
-          <m:rPr>
-            <m:sty m:val="bi"/>
-          </m:rPr>
-          <w:rPr>
-            <w:rFonts w:ascii="Cambria Math" w:hAnsi="Cambria Math"/>
-          </w:rPr>
-          <m:t>x</m:t>
+          <w:rPr>
+            <w:rFonts w:ascii="Cambria Math" w:hAnsi="Cambria Math"/>
+          </w:rPr>
+          <m:t>X</m:t>
         </m:r>
         <m:r>
           <m:rPr>
@@ -3557,13 +3436,10 @@
           <m:t>Δ</m:t>
         </m:r>
         <m:r>
-          <m:rPr>
-            <m:sty m:val="bi"/>
-          </m:rPr>
-          <w:rPr>
-            <w:rFonts w:ascii="Cambria Math" w:hAnsi="Cambria Math"/>
-          </w:rPr>
-          <m:t>x</m:t>
+          <w:rPr>
+            <w:rFonts w:ascii="Cambria Math" w:hAnsi="Cambria Math"/>
+          </w:rPr>
+          <m:t>X</m:t>
         </m:r>
         <m:r>
           <m:rPr>
@@ -3696,7 +3572,7 @@
                   <m:mcs>
                     <m:mc>
                       <m:mcPr>
-                        <m:count m:val="2"/>
+                        <m:count m:val="1"/>
                         <m:mcJc m:val="left"/>
                       </m:mcPr>
                     </m:mc>
@@ -3765,7 +3641,7 @@
                           <m:e>
                             <m:r>
                               <m:rPr>
-                                <m:sty m:val="b"/>
+                                <m:sty m:val="p"/>
                               </m:rPr>
                               <w:rPr>
                                 <w:rFonts w:ascii="Cambria Math" w:hAnsi="Cambria Math"/>
@@ -3804,23 +3680,17 @@
                           </m:sSubPr>
                           <m:e>
                             <m:r>
-                              <m:rPr>
-                                <m:sty m:val="bi"/>
-                              </m:rPr>
                               <w:rPr>
                                 <w:rFonts w:ascii="Cambria Math" w:hAnsi="Cambria Math"/>
                               </w:rPr>
-                              <m:t>x</m:t>
+                              <m:t>X</m:t>
                             </m:r>
                           </m:e>
                           <m:sub>
                             <m:r>
                               <m:rPr>
-                                <m:sty m:val="p"/>
+                                <m:nor/>
                               </m:rPr>
-                              <w:rPr>
-                                <w:rFonts w:ascii="Cambria Math" w:hAnsi="Cambria Math"/>
-                              </w:rPr>
                               <m:t>target</m:t>
                             </m:r>
                           </m:sub>
@@ -3859,23 +3729,17 @@
                           </m:sSubPr>
                           <m:e>
                             <m:r>
-                              <m:rPr>
-                                <m:sty m:val="bi"/>
-                              </m:rPr>
                               <w:rPr>
                                 <w:rFonts w:ascii="Cambria Math" w:hAnsi="Cambria Math"/>
                               </w:rPr>
-                              <m:t>x</m:t>
+                              <m:t>X</m:t>
                             </m:r>
                           </m:e>
                           <m:sub>
                             <m:r>
                               <m:rPr>
-                                <m:sty m:val="p"/>
+                                <m:nor/>
                               </m:rPr>
-                              <w:rPr>
-                                <w:rFonts w:ascii="Cambria Math" w:hAnsi="Cambria Math"/>
-                              </w:rPr>
                               <m:t>state</m:t>
                             </m:r>
                           </m:sub>
@@ -3905,13 +3769,10 @@
                           <m:t>),Δ</m:t>
                         </m:r>
                         <m:r>
-                          <m:rPr>
-                            <m:sty m:val="bi"/>
-                          </m:rPr>
                           <w:rPr>
                             <w:rFonts w:ascii="Cambria Math" w:hAnsi="Cambria Math"/>
                           </w:rPr>
-                          <m:t>x</m:t>
+                          <m:t>X</m:t>
                         </m:r>
                         <m:r>
                           <m:rPr>
@@ -3955,7 +3816,15 @@
                       </m:e>
                     </m:d>
                   </m:e>
+                </m:mr>
+                <m:mr>
                   <m:e>
+                    <m:r>
+                      <w:rPr>
+                        <w:rFonts w:ascii="Cambria Math" w:hAnsi="Cambria Math"/>
+                      </w:rPr>
+                      <m:t> </m:t>
+                    </m:r>
                     <m:r>
                       <m:rPr>
                         <m:nor/>
@@ -3985,9 +3854,6 @@
                           </m:sSupPr>
                           <m:e>
                             <m:r>
-                              <m:rPr>
-                                <m:sty m:val="bi"/>
-                              </m:rPr>
                               <w:rPr>
                                 <w:rFonts w:ascii="Cambria Math" w:hAnsi="Cambria Math"/>
                               </w:rPr>
@@ -4031,13 +3897,10 @@
                           <m:t>),Δ</m:t>
                         </m:r>
                         <m:r>
-                          <m:rPr>
-                            <m:sty m:val="bi"/>
-                          </m:rPr>
                           <w:rPr>
                             <w:rFonts w:ascii="Cambria Math" w:hAnsi="Cambria Math"/>
                           </w:rPr>
-                          <m:t>x</m:t>
+                          <m:t>X</m:t>
                         </m:r>
                         <m:r>
                           <m:rPr>
@@ -4110,7 +3973,15 @@
                       <m:t>))</m:t>
                     </m:r>
                   </m:e>
+                </m:mr>
+                <m:mr>
                   <m:e>
+                    <m:r>
+                      <w:rPr>
+                        <w:rFonts w:ascii="Cambria Math" w:hAnsi="Cambria Math"/>
+                      </w:rPr>
+                      <m:t> </m:t>
+                    </m:r>
                     <m:r>
                       <m:rPr>
                         <m:nor/>
@@ -4122,13 +3993,10 @@
                 <m:mr>
                   <m:e>
                     <m:r>
-                      <m:rPr>
-                        <m:sty m:val="bi"/>
-                      </m:rPr>
                       <w:rPr>
                         <w:rFonts w:ascii="Cambria Math" w:hAnsi="Cambria Math"/>
                       </w:rPr>
-                      <m:t>x</m:t>
+                      <m:t>X</m:t>
                     </m:r>
                     <m:r>
                       <m:rPr>
@@ -4170,13 +4038,10 @@
                       <m:t>)=</m:t>
                     </m:r>
                     <m:r>
-                      <m:rPr>
-                        <m:sty m:val="bi"/>
-                      </m:rPr>
                       <w:rPr>
                         <w:rFonts w:ascii="Cambria Math" w:hAnsi="Cambria Math"/>
                       </w:rPr>
-                      <m:t>x</m:t>
+                      <m:t>X</m:t>
                     </m:r>
                     <m:r>
                       <m:rPr>
@@ -4203,13 +4068,10 @@
                       <m:t>)+Δ</m:t>
                     </m:r>
                     <m:r>
-                      <m:rPr>
-                        <m:sty m:val="bi"/>
-                      </m:rPr>
                       <w:rPr>
                         <w:rFonts w:ascii="Cambria Math" w:hAnsi="Cambria Math"/>
                       </w:rPr>
-                      <m:t>x</m:t>
+                      <m:t>X</m:t>
                     </m:r>
                     <m:r>
                       <m:rPr>
@@ -4236,7 +4098,15 @@
                       <m:t>)</m:t>
                     </m:r>
                   </m:e>
+                </m:mr>
+                <m:mr>
                   <m:e>
+                    <m:r>
+                      <w:rPr>
+                        <w:rFonts w:ascii="Cambria Math" w:hAnsi="Cambria Math"/>
+                      </w:rPr>
+                      <m:t> </m:t>
+                    </m:r>
                     <m:r>
                       <m:rPr>
                         <m:nor/>
@@ -4268,7 +4138,7 @@
       <m:oMath>
         <m:r>
           <m:rPr>
-            <m:sty m:val="b"/>
+            <m:sty m:val="p"/>
           </m:rPr>
           <w:rPr>
             <w:rFonts w:ascii="Cambria Math" w:hAnsi="Cambria Math"/>
@@ -4352,7 +4222,10 @@
         </m:sSub>
       </m:oMath>
       <w:r>
-        <w:t xml:space="preserve"> via topological sorting and constraint propagation; rigid manifold </w:t>
+        <w:t xml:space="preserve"> </w:t>
+      </w:r>
+      <w:r>
+        <w:t xml:space="preserve">via topological sorting and constraint propagation; rigid manifold </w:t>
       </w:r>
       <m:oMath>
         <m:sSub>
@@ -4366,7 +4239,7 @@
           <m:e>
             <m:r>
               <m:rPr>
-                <m:sty m:val="b"/>
+                <m:sty m:val="p"/>
               </m:rPr>
               <w:rPr>
                 <w:rFonts w:ascii="Cambria Math" w:hAnsi="Cambria Math"/>
@@ -4495,7 +4368,7 @@
       <m:oMath>
         <m:r>
           <m:rPr>
-            <m:sty m:val="b"/>
+            <m:sty m:val="p"/>
           </m:rPr>
           <w:rPr>
             <w:rFonts w:ascii="Cambria Math" w:hAnsi="Cambria Math"/>
@@ -4771,10 +4644,7 @@
         </m:r>
       </m:oMath>
       <w:r>
-        <w:t xml:space="preserve"> </w:t>
-      </w:r>
-      <w:r>
-        <w:t>represents an empirical tight upper bound for our studied manufacturing networks, successfully solving the combinatorial explosion of complex giant systems.</w:t>
+        <w:t xml:space="preserve"> represents an empirical tight upper bound for our studied manufacturing networks, rather than an unconditional universal bound; in engineering practice, take the tighter bound, successfully solving the combinatorial explosion of complex giant systems.</w:t>
       </w:r>
     </w:p>
     <w:p>
@@ -5000,7 +4870,7 @@
           <m:e>
             <m:r>
               <m:rPr>
-                <m:sty m:val="b"/>
+                <m:sty m:val="p"/>
               </m:rPr>
               <w:rPr>
                 <w:rFonts w:ascii="Cambria Math" w:hAnsi="Cambria Math"/>
@@ -5022,7 +4892,7 @@
         </m:sSub>
       </m:oMath>
       <w:r>
-        <w:t xml:space="preserve">, eliminating time-reversal and causal-backtracking spurious degrees of freedom. For a fixed boundary, single-step orthogonal matching and topological sorting complexity is </w:t>
+        <w:t xml:space="preserve">, eliminating time-reversal and causal-backtracking spurious degrees of freedom. For a fixed boundary, single-step orthogonal matching and pruning complexity is </w:t>
       </w:r>
       <m:oMath>
         <m:r>
@@ -5072,7 +4942,11 @@
         </m:r>
       </m:oMath>
       <w:r>
-        <w:t xml:space="preserve">. Advancing along unidirectional causal lines for </w:t>
+        <w:t xml:space="preserve">. </w:t>
+      </w:r>
+      <w:r>
+        <w:lastRenderedPageBreak/>
+        <w:t xml:space="preserve">Advancing along unidirectional causal lines for </w:t>
       </w:r>
       <m:oMath>
         <m:r>
@@ -5498,11 +5372,7 @@
         </m:r>
       </m:oMath>
       <w:r>
-        <w:t xml:space="preserve">). Hitting physical lower bound 0 is definitional equivalent to in-boundary absolute optimality; under rigid exclusivity, physical execution trajectories have no choice </w:t>
-      </w:r>
-      <w:r>
-        <w:lastRenderedPageBreak/>
-        <w:t xml:space="preserve">but to converge to a unique absolute optimal steady state </w:t>
+        <w:t xml:space="preserve">). Hitting physical lower bound 0 is definitional equivalent to in-boundary absolute optimality; under rigid exclusivity, physical execution trajectories have no choice but to converge to a unique absolute optimal steady state </w:t>
       </w:r>
       <m:oMath>
         <m:sSubSup>
@@ -5515,13 +5385,10 @@
           </m:sSubSupPr>
           <m:e>
             <m:r>
-              <m:rPr>
-                <m:sty m:val="bi"/>
-              </m:rPr>
-              <w:rPr>
-                <w:rFonts w:ascii="Cambria Math" w:hAnsi="Cambria Math"/>
-              </w:rPr>
-              <m:t>x</m:t>
+              <w:rPr>
+                <w:rFonts w:ascii="Cambria Math" w:hAnsi="Cambria Math"/>
+              </w:rPr>
+              <m:t>S</m:t>
             </m:r>
           </m:e>
           <m:sub>
@@ -5582,7 +5449,7 @@
         <w:pStyle w:val="a0"/>
       </w:pPr>
       <w:r>
-        <w:t xml:space="preserve">To prevent Goodhart’s Law breakdown under extreme optimization pressure (where an indicator target loses validity, </w:t>
+        <w:t xml:space="preserve">To prevent Goodhart’s Law breakdown under extreme optimization pressure (when an indicator is chosen as a performance target, it ceases to be a good indicator and induces extreme arbitrage, </w:t>
       </w:r>
       <m:oMath>
         <m:sSub>
@@ -5687,9 +5554,6 @@
           </m:sSubPr>
           <m:e>
             <m:r>
-              <m:rPr>
-                <m:sty m:val="bi"/>
-              </m:rPr>
               <w:rPr>
                 <w:rFonts w:ascii="Cambria Math" w:hAnsi="Cambria Math"/>
               </w:rPr>
@@ -5699,18 +5563,15 @@
           <m:sub>
             <m:r>
               <m:rPr>
-                <m:sty m:val="p"/>
-              </m:rPr>
-              <w:rPr>
-                <w:rFonts w:ascii="Cambria Math" w:hAnsi="Cambria Math"/>
-              </w:rPr>
+                <m:nor/>
+              </m:rPr>
               <m:t>supp</m:t>
             </m:r>
           </m:sub>
         </m:sSub>
       </m:oMath>
       <w:r>
-        <w:t xml:space="preserve"> (Conscience Operator). Operator </w:t>
+        <w:t xml:space="preserve"> (Conscience Operator), suspended on target and residual distributions. Operator </w:t>
       </w:r>
       <m:oMath>
         <m:sSub>
@@ -5723,9 +5584,6 @@
           </m:sSubPr>
           <m:e>
             <m:r>
-              <m:rPr>
-                <m:sty m:val="bi"/>
-              </m:rPr>
               <w:rPr>
                 <w:rFonts w:ascii="Cambria Math" w:hAnsi="Cambria Math"/>
               </w:rPr>
@@ -5735,11 +5593,8 @@
           <m:sub>
             <m:r>
               <m:rPr>
-                <m:sty m:val="p"/>
-              </m:rPr>
-              <w:rPr>
-                <w:rFonts w:ascii="Cambria Math" w:hAnsi="Cambria Math"/>
-              </w:rPr>
+                <m:nor/>
+              </m:rPr>
               <m:t>supp</m:t>
             </m:r>
           </m:sub>
@@ -5762,25 +5617,7 @@
           <w:rPr>
             <w:rFonts w:ascii="Cambria Math" w:hAnsi="Cambria Math"/>
           </w:rPr>
-          <m:t>(</m:t>
-        </m:r>
-        <m:r>
-          <m:rPr>
-            <m:sty m:val="b"/>
-          </m:rPr>
-          <w:rPr>
-            <w:rFonts w:ascii="Cambria Math" w:hAnsi="Cambria Math"/>
-          </w:rPr>
-          <m:t>Δ</m:t>
-        </m:r>
-        <m:r>
-          <m:rPr>
-            <m:sty m:val="p"/>
-          </m:rPr>
-          <w:rPr>
-            <w:rFonts w:ascii="Cambria Math" w:hAnsi="Cambria Math"/>
-          </w:rPr>
-          <m:t>)</m:t>
+          <m:t>(Δ)</m:t>
         </m:r>
       </m:oMath>
       <w:r>
@@ -5885,25 +5722,13 @@
             <w:rPr>
               <w:rFonts w:ascii="Cambria Math" w:hAnsi="Cambria Math"/>
             </w:rPr>
-            <m:t>Var(</m:t>
+            <m:t>Var(Δ</m:t>
           </m:r>
           <m:r>
-            <m:rPr>
-              <m:sty m:val="b"/>
-            </m:rPr>
             <w:rPr>
               <w:rFonts w:ascii="Cambria Math" w:hAnsi="Cambria Math"/>
             </w:rPr>
-            <m:t>Δ</m:t>
-          </m:r>
-          <m:r>
-            <m:rPr>
-              <m:sty m:val="bi"/>
-            </m:rPr>
-            <w:rPr>
-              <w:rFonts w:ascii="Cambria Math" w:hAnsi="Cambria Math"/>
-            </w:rPr>
-            <m:t>x</m:t>
+            <m:t>X</m:t>
           </m:r>
           <m:r>
             <m:rPr>
@@ -5992,7 +5817,7 @@
       <m:oMath>
         <m:r>
           <m:rPr>
-            <m:sty m:val="b"/>
+            <m:sty m:val="p"/>
           </m:rPr>
           <w:rPr>
             <w:rFonts w:ascii="Cambria Math" w:hAnsi="Cambria Math"/>
@@ -6001,7 +5826,10 @@
         </m:r>
       </m:oMath>
       <w:r>
-        <w:t xml:space="preserve"> boundary drawing, rigid manifold </w:t>
+        <w:t xml:space="preserve"> </w:t>
+      </w:r>
+      <w:r>
+        <w:t xml:space="preserve">boundary drawing, rigid manifold </w:t>
       </w:r>
       <m:oMath>
         <m:sSub>
@@ -6015,7 +5843,7 @@
           <m:e>
             <m:r>
               <m:rPr>
-                <m:sty m:val="b"/>
+                <m:sty m:val="p"/>
               </m:rPr>
               <w:rPr>
                 <w:rFonts w:ascii="Cambria Math" w:hAnsi="Cambria Math"/>
@@ -6042,7 +5870,7 @@
       <m:oMath>
         <m:r>
           <m:rPr>
-            <m:sty m:val="b"/>
+            <m:sty m:val="p"/>
           </m:rPr>
           <w:rPr>
             <w:rFonts w:ascii="Cambria Math" w:hAnsi="Cambria Math"/>
@@ -6160,7 +5988,7 @@
         <w:pStyle w:val="FirstParagraph"/>
       </w:pPr>
       <w:r>
-        <w:t>This paper formally proposes and proves the formal proof theorem for Qian Xuesen’s three core OCGS principles in entity discrete manufacturing value networks featuring causal DAG structures:</w:t>
+        <w:t>This paper formally proposes and proves the formal proof theorem for Qian Xuesen’s three core OCGS principles in entity discrete manufacturing value networks as a class of OCGS featuring causal DAG structures:</w:t>
       </w:r>
     </w:p>
     <w:p>
@@ -6172,7 +6000,7 @@
           <w:b/>
           <w:bCs/>
         </w:rPr>
-        <w:t>Theorem (Formal Proof Theorem for Qian Xuesen’s Metasynthetic Department, HWDS, and Human-Machine Combination/Human-Led Principles)</w:t>
+        <w:t>Theorem (Formal Proof Theorem for Qian Xuesen’s Overall Design Department, HWME, and Human-Machine Combination/Human-Led Principles)</w:t>
       </w:r>
       <w:r>
         <w:t>:</w:t>
@@ -6231,7 +6059,7 @@
           <w:b/>
           <w:bCs/>
         </w:rPr>
-        <w:t>Mathematical Necessity and Sufficiency Proof for “Metasynthetic Department”</w:t>
+        <w:t>Mathematical Necessity and Sufficiency Proof for “Overall Design Department”</w:t>
       </w:r>
       <w:r>
         <w:t>:</w:t>
@@ -6243,7 +6071,7 @@
       <m:oMath>
         <m:r>
           <m:rPr>
-            <m:sty m:val="b"/>
+            <m:sty m:val="p"/>
           </m:rPr>
           <w:rPr>
             <w:rFonts w:ascii="Cambria Math" w:hAnsi="Cambria Math"/>
@@ -6252,7 +6080,11 @@
         </m:r>
       </m:oMath>
       <w:r>
-        <w:t xml:space="preserve"> and centralized quota/manifold governance forces sub-domain optimizations into vector triangle inequalities, generating global vector cancellation waste heat </w:t>
+        <w:t xml:space="preserve"> and centralized quota/manifold governance forces sub-domain optimizations into vector triangle inequalities, generating global vector </w:t>
+      </w:r>
+      <w:r>
+        <w:lastRenderedPageBreak/>
+        <w:t xml:space="preserve">cancellation waste heat </w:t>
       </w:r>
       <m:oMath>
         <m:r>
@@ -6380,10 +6212,7 @@
         </m:r>
       </m:oMath>
       <w:r>
-        <w:t xml:space="preserve"> </w:t>
-      </w:r>
-      <w:r>
-        <w:t xml:space="preserve">and locking the system into non-cooperative Nash equilibrium deadlocks. Thus, under our Non-IID vector cancellation framework, Qian Xuesen’s “Metasynthetic Department” is the Necessary condition for breaking Nash deadlocks and eliminating waste heat; coupled with linear manifold constraints imposed by rigid barrier </w:t>
+        <w:t xml:space="preserve"> and locking the system into non-cooperative Nash equilibrium deadlocks and Brownian motion internal friction. Thus, under our Non-IID vector cancellation framework, Qian Xuesen’s “Overall Design Department” is the Necessary condition for breaking Nash deadlocks and eliminating waste heat; coupled with linear manifold constraints imposed by rigid barrier </w:t>
       </w:r>
       <m:oMath>
         <m:sSub>
@@ -6397,7 +6226,7 @@
           <m:e>
             <m:r>
               <m:rPr>
-                <m:sty m:val="b"/>
+                <m:sty m:val="p"/>
               </m:rPr>
               <w:rPr>
                 <w:rFonts w:ascii="Cambria Math" w:hAnsi="Cambria Math"/>
@@ -6434,18 +6263,14 @@
           <w:b/>
           <w:bCs/>
         </w:rPr>
-        <w:t>Self-Consistent Computability Proof for “Hall of Workshop for Decision Support (HWDS)”</w:t>
+        <w:t>Closed-Loop Computability Proof for “Hall for Workshop of Metasynthetic Engineering (HWME)”</w:t>
       </w:r>
       <w:r>
         <w:t>:</w:t>
       </w:r>
       <w:r>
         <w:br/>
-        <w:t xml:space="preserve">Proving that the 5D Dual-Helix (Holographic Data Model + Dynamic Evolution </w:t>
-      </w:r>
-      <w:r>
-        <w:lastRenderedPageBreak/>
-        <w:t xml:space="preserve">Algorithm) prunes phase space to </w:t>
+        <w:t xml:space="preserve">Proving that the 5D Dual-Helix (Holographic Data Model + Dynamic Evolution Algorithm) prunes phase space to </w:t>
       </w:r>
       <m:oMath>
         <m:sSub>
@@ -6486,7 +6311,7 @@
       <m:oMath>
         <m:r>
           <m:rPr>
-            <m:sty m:val="b"/>
+            <m:sty m:val="p"/>
           </m:rPr>
           <w:rPr>
             <w:rFonts w:ascii="Cambria Math" w:hAnsi="Cambria Math"/>
@@ -6572,7 +6397,7 @@
           <m:e>
             <m:r>
               <m:rPr>
-                <m:sty m:val="b"/>
+                <m:sty m:val="p"/>
               </m:rPr>
               <w:rPr>
                 <w:rFonts w:ascii="Cambria Math" w:hAnsi="Cambria Math"/>
@@ -6750,7 +6575,7 @@
       <m:oMath>
         <m:r>
           <m:rPr>
-            <m:sty m:val="b"/>
+            <m:sty m:val="p"/>
           </m:rPr>
           <w:rPr>
             <w:rFonts w:ascii="Cambria Math" w:hAnsi="Cambria Math"/>
@@ -6773,7 +6598,7 @@
           <m:e>
             <m:r>
               <m:rPr>
-                <m:sty m:val="b"/>
+                <m:sty m:val="p"/>
               </m:rPr>
               <w:rPr>
                 <w:rFonts w:ascii="Cambria Math" w:hAnsi="Cambria Math"/>
@@ -6828,13 +6653,10 @@
           </m:sSubSupPr>
           <m:e>
             <m:r>
-              <m:rPr>
-                <m:sty m:val="bi"/>
-              </m:rPr>
-              <w:rPr>
-                <w:rFonts w:ascii="Cambria Math" w:hAnsi="Cambria Math"/>
-              </w:rPr>
-              <m:t>x</m:t>
+              <w:rPr>
+                <w:rFonts w:ascii="Cambria Math" w:hAnsi="Cambria Math"/>
+              </w:rPr>
+              <m:t>S</m:t>
             </m:r>
           </m:e>
           <m:sub>
@@ -6859,10 +6681,10 @@
         </m:sSubSup>
       </m:oMath>
       <w:r>
-        <w:t xml:space="preserve"> (whose work efficiency strictly surpasses any open-loop Nash equilibrium). This constitutes the mathematical mechanism by which Qian’s HWDS conquers computational irreducibility, supplying the Sufficient mechanism for universal computability; necessity is defined by complexity lower bounds: general Non-IID scheduling networks (including Job-Shop Scheduling as a special case) are NP-hard, so no universal polynomial-time algorithm exists for all instances; our framework guarantees polynomial closed-loop comp</w:t>
-      </w:r>
-      <w:r>
-        <w:t>utability based on physical instability window truncation of causal DAG depth (</w:t>
+        <w:t xml:space="preserve"> (whose work efficiency strictly surpasses any open-loop Nash equilibrium). This constitutes the mathematical mechanism by which Qian’s HWME conquers computational irreducibility, supplying the Sufficient mechanism for closed-loop computability; necessity is defined by complexity lower bounds: general Non-IID scheduling networks (including Job-Shop Scheduling as a special case) are NP-hard, so no universal polynomial-time algorithm exists for all instances; our framework guarantees polynomial closed-loop co</w:t>
+      </w:r>
+      <w:r>
+        <w:t>mputability based on physical instability window truncation of causal DAG depth (</w:t>
       </w:r>
       <m:oMath>
         <m:r>
@@ -6935,7 +6757,16 @@
               <w:rPr>
                 <w:rFonts w:ascii="Cambria Math" w:hAnsi="Cambria Math"/>
               </w:rPr>
-              <m:t>Silicon</m:t>
+              <m:t>Sili</m:t>
+            </m:r>
+            <m:r>
+              <m:rPr>
+                <m:sty m:val="p"/>
+              </m:rPr>
+              <w:rPr>
+                <w:rFonts w:ascii="Cambria Math" w:hAnsi="Cambria Math"/>
+              </w:rPr>
+              <m:t>con</m:t>
             </m:r>
           </m:sub>
         </m:sSub>
@@ -6955,7 +6786,7 @@
           <m:e>
             <m:r>
               <m:rPr>
-                <m:sty m:val="b"/>
+                <m:sty m:val="p"/>
               </m:rPr>
               <w:rPr>
                 <w:rFonts w:ascii="Cambria Math" w:hAnsi="Cambria Math"/>
@@ -6979,21 +6810,12 @@
       <m:oMath>
         <m:r>
           <m:rPr>
-            <m:sty m:val="b"/>
-          </m:rPr>
-          <w:rPr>
-            <w:rFonts w:ascii="Cambria Math" w:hAnsi="Cambria Math"/>
-          </w:rPr>
-          <m:t>Δ</m:t>
-        </m:r>
-        <m:r>
-          <m:rPr>
-            <m:sty m:val="p"/>
-          </m:rPr>
-          <w:rPr>
-            <w:rFonts w:ascii="Cambria Math" w:hAnsi="Cambria Math"/>
-          </w:rPr>
-          <m:t>&gt;</m:t>
+            <m:sty m:val="p"/>
+          </m:rPr>
+          <w:rPr>
+            <w:rFonts w:ascii="Cambria Math" w:hAnsi="Cambria Math"/>
+          </w:rPr>
+          <m:t>Δ&gt;</m:t>
         </m:r>
         <m:sSub>
           <m:sSubPr>
@@ -7039,7 +6861,7 @@
           <m:e>
             <m:r>
               <m:rPr>
-                <m:sty m:val="b"/>
+                <m:sty m:val="p"/>
               </m:rPr>
               <w:rPr>
                 <w:rFonts w:ascii="Cambria Math" w:hAnsi="Cambria Math"/>
@@ -7087,7 +6909,7 @@
           <m:e>
             <m:r>
               <m:rPr>
-                <m:sty m:val="b"/>
+                <m:sty m:val="p"/>
               </m:rPr>
               <w:rPr>
                 <w:rFonts w:ascii="Cambria Math" w:hAnsi="Cambria Math"/>
@@ -7106,7 +6928,7 @@
         </m:sSub>
       </m:oMath>
       <w:r>
-        <w:t xml:space="preserve"> becomes unsolvable or suffers reconstruction failure. Human second-order meta-control operator </w:t>
+        <w:t xml:space="preserve"> becomes unsolvable or suffers reconstruction failure. Second-Order Meta-Cognitive Constitutional Rewriting Operator </w:t>
       </w:r>
       <m:oMath>
         <m:sSub>
@@ -7120,7 +6942,7 @@
           <m:e>
             <m:r>
               <m:rPr>
-                <m:sty m:val="b"/>
+                <m:sty m:val="p"/>
               </m:rPr>
               <w:rPr>
                 <w:rFonts w:ascii="Cambria Math" w:hAnsi="Cambria Math"/>
@@ -7160,7 +6982,7 @@
           <m:e>
             <m:r>
               <m:rPr>
-                <m:sty m:val="b"/>
+                <m:sty m:val="p"/>
               </m:rPr>
               <w:rPr>
                 <w:rFonts w:ascii="Cambria Math" w:hAnsi="Cambria Math"/>
@@ -7197,7 +7019,7 @@
           <m:e>
             <m:r>
               <m:rPr>
-                <m:sty m:val="b"/>
+                <m:sty m:val="p"/>
               </m:rPr>
               <w:rPr>
                 <w:rFonts w:ascii="Cambria Math" w:hAnsi="Cambria Math"/>
@@ -7231,10 +7053,7 @@
         </m:sSub>
       </m:oMath>
       <w:r>
-        <w:t xml:space="preserve"> </w:t>
-      </w:r>
-      <w:r>
-        <w:t>(corresponding to high-level prefrontal self-reflection in cognitive science) provides cross-framework axiom rewriting capacity. The global work operator must be expressed as:</w:t>
+        <w:t xml:space="preserve"> (corresponding to high-level prefrontal self-reflection in cognitive science) provides cross-framework axiom rewriting capacity. The global work operator must be expressed as:</w:t>
       </w:r>
     </w:p>
     <w:p>
@@ -7272,7 +7091,7 @@
             <m:e>
               <m:r>
                 <m:rPr>
-                  <m:sty m:val="b"/>
+                  <m:sty m:val="p"/>
                 </m:rPr>
                 <w:rPr>
                   <w:rFonts w:ascii="Cambria Math" w:hAnsi="Cambria Math"/>
@@ -7341,7 +7160,8 @@
         <w:pStyle w:val="FirstParagraph"/>
       </w:pPr>
       <w:r>
-        <w:t xml:space="preserve">Within our operator decomposition framework, human second-order self-reflection operator </w:t>
+        <w:lastRenderedPageBreak/>
+        <w:t xml:space="preserve">Within our operator decomposition framework, Second-Order Meta-Cognitive Constitutional Rewriting Operator </w:t>
       </w:r>
       <m:oMath>
         <m:sSub>
@@ -7355,7 +7175,7 @@
           <m:e>
             <m:r>
               <m:rPr>
-                <m:sty m:val="b"/>
+                <m:sty m:val="p"/>
               </m:rPr>
               <w:rPr>
                 <w:rFonts w:ascii="Cambria Math" w:hAnsi="Cambria Math"/>
@@ -7391,7 +7211,7 @@
           <m:e>
             <m:r>
               <m:rPr>
-                <m:sty m:val="b"/>
+                <m:sty m:val="p"/>
               </m:rPr>
               <w:rPr>
                 <w:rFonts w:ascii="Cambria Math" w:hAnsi="Cambria Math"/>
@@ -7459,45 +7279,36 @@
       <m:oMath>
         <m:r>
           <m:rPr>
-            <m:sty m:val="b"/>
+            <m:sty m:val="p"/>
+          </m:rPr>
+          <w:rPr>
+            <w:rFonts w:ascii="Cambria Math" w:hAnsi="Cambria Math"/>
+          </w:rPr>
+          <m:t>Φ≡</m:t>
+        </m:r>
+        <m:r>
+          <w:rPr>
+            <w:rFonts w:ascii="Cambria Math" w:hAnsi="Cambria Math"/>
+          </w:rPr>
+          <m:t>0</m:t>
+        </m:r>
+      </m:oMath>
+      <w:r>
+        <w:t xml:space="preserve"> (pure silicon closed loop), when residuals breach critical thresholds, no analytical self-healing trajectory exists within given axiom sets. Generalization to general OCGS requires reconstructing the physical carrier of </w:t>
+      </w:r>
+      <m:oMath>
+        <m:r>
+          <m:rPr>
+            <m:sty m:val="p"/>
           </m:rPr>
           <w:rPr>
             <w:rFonts w:ascii="Cambria Math" w:hAnsi="Cambria Math"/>
           </w:rPr>
           <m:t>Φ</m:t>
         </m:r>
-        <m:r>
-          <m:rPr>
-            <m:sty m:val="p"/>
-          </m:rPr>
-          <w:rPr>
-            <w:rFonts w:ascii="Cambria Math" w:hAnsi="Cambria Math"/>
-          </w:rPr>
-          <m:t>≡</m:t>
-        </m:r>
-        <m:r>
-          <w:rPr>
-            <w:rFonts w:ascii="Cambria Math" w:hAnsi="Cambria Math"/>
-          </w:rPr>
-          <m:t>0</m:t>
-        </m:r>
-      </m:oMath>
-      <w:r>
-        <w:t xml:space="preserve"> (pure silicon closed loop), when residuals breach critical thresholds, no analytical self-healing trajectory exists within given axiom sets. Generalization to general OCGS requires reconstructing physical carriers and observation domains for </w:t>
-      </w:r>
-      <m:oMath>
-        <m:r>
-          <m:rPr>
-            <m:sty m:val="b"/>
-          </m:rPr>
-          <w:rPr>
-            <w:rFonts w:ascii="Cambria Math" w:hAnsi="Cambria Math"/>
-          </w:rPr>
-          <m:t>Φ</m:t>
-        </m:r>
-      </m:oMath>
-      <w:r>
-        <w:t>.</w:t>
+      </m:oMath>
+      <w:r>
+        <w:t xml:space="preserve"> and observation domains.</w:t>
       </w:r>
     </w:p>
     <w:p>
@@ -7523,7 +7334,7 @@
           <w:b/>
           <w:bCs/>
         </w:rPr>
-        <w:t>Metasynthetic Department Necessity &amp; Sufficiency</w:t>
+        <w:t>Overall Design Department Necessity &amp; Sufficiency</w:t>
       </w:r>
       <w:r>
         <w:t xml:space="preserve">: Under Non-IID connectivity matrix </w:t>
@@ -7798,11 +7609,7 @@
         </m:r>
       </m:oMath>
       <w:r>
-        <w:t xml:space="preserve">. In our linear </w:t>
-      </w:r>
-      <w:r>
-        <w:lastRenderedPageBreak/>
-        <w:t xml:space="preserve">vector cancellation framework, a Metasynthetic Department is Necessary for breaking Nash deadlocks; coupled with </w:t>
+        <w:t xml:space="preserve">. In our linear vector cancellation framework, an Overall Design Department is Necessary for breaking Nash deadlocks; coupled with </w:t>
       </w:r>
       <m:oMath>
         <m:sSub>
@@ -7816,7 +7623,7 @@
           <m:e>
             <m:r>
               <m:rPr>
-                <m:sty m:val="b"/>
+                <m:sty m:val="p"/>
               </m:rPr>
               <w:rPr>
                 <w:rFonts w:ascii="Cambria Math" w:hAnsi="Cambria Math"/>
@@ -7845,7 +7652,7 @@
           <w:b/>
           <w:bCs/>
         </w:rPr>
-        <w:t>HWME Computability</w:t>
+        <w:t>HWME Closed-Loop Computability</w:t>
       </w:r>
       <w:r>
         <w:t xml:space="preserve">: Via </w:t>
@@ -7853,7 +7660,7 @@
       <m:oMath>
         <m:r>
           <m:rPr>
-            <m:sty m:val="b"/>
+            <m:sty m:val="p"/>
           </m:rPr>
           <w:rPr>
             <w:rFonts w:ascii="Cambria Math" w:hAnsi="Cambria Math"/>
@@ -7950,7 +7757,7 @@
           <m:e>
             <m:r>
               <m:rPr>
-                <m:sty m:val="b"/>
+                <m:sty m:val="p"/>
               </m:rPr>
               <w:rPr>
                 <w:rFonts w:ascii="Cambria Math" w:hAnsi="Cambria Math"/>
@@ -7977,7 +7784,7 @@
       <m:oMath>
         <m:r>
           <m:rPr>
-            <m:sty m:val="b"/>
+            <m:sty m:val="p"/>
           </m:rPr>
           <w:rPr>
             <w:rFonts w:ascii="Cambria Math" w:hAnsi="Cambria Math"/>
@@ -8100,13 +7907,10 @@
           </m:sSubSupPr>
           <m:e>
             <m:r>
-              <m:rPr>
-                <m:sty m:val="bi"/>
-              </m:rPr>
-              <w:rPr>
-                <w:rFonts w:ascii="Cambria Math" w:hAnsi="Cambria Math"/>
-              </w:rPr>
-              <m:t>x</m:t>
+              <w:rPr>
+                <w:rFonts w:ascii="Cambria Math" w:hAnsi="Cambria Math"/>
+              </w:rPr>
+              <m:t>S</m:t>
             </m:r>
           </m:e>
           <m:sub>
@@ -8131,10 +7935,7 @@
         </m:sSubSup>
       </m:oMath>
       <w:r>
-        <w:t xml:space="preserve"> </w:t>
-      </w:r>
-      <w:r>
-        <w:t xml:space="preserve">(strictly superior to any open-loop Nash equilibrium). Under boundary and dissipation constructs, universal computability holds. 3. </w:t>
+        <w:t xml:space="preserve"> (strictly superior to any open-loop Nash equilibrium). Under boundary and dissipation constructs, closed-loop computability holds. 3. </w:t>
       </w:r>
       <w:r>
         <w:rPr>
@@ -8173,7 +7974,7 @@
           <m:e>
             <m:r>
               <m:rPr>
-                <m:sty m:val="b"/>
+                <m:sty m:val="p"/>
               </m:rPr>
               <w:rPr>
                 <w:rFonts w:ascii="Cambria Math" w:hAnsi="Cambria Math"/>
@@ -8197,21 +7998,12 @@
       <m:oMath>
         <m:r>
           <m:rPr>
-            <m:sty m:val="b"/>
-          </m:rPr>
-          <w:rPr>
-            <w:rFonts w:ascii="Cambria Math" w:hAnsi="Cambria Math"/>
-          </w:rPr>
-          <m:t>Δ</m:t>
-        </m:r>
-        <m:r>
-          <m:rPr>
-            <m:sty m:val="p"/>
-          </m:rPr>
-          <w:rPr>
-            <w:rFonts w:ascii="Cambria Math" w:hAnsi="Cambria Math"/>
-          </w:rPr>
-          <m:t>&gt;</m:t>
+            <m:sty m:val="p"/>
+          </m:rPr>
+          <w:rPr>
+            <w:rFonts w:ascii="Cambria Math" w:hAnsi="Cambria Math"/>
+          </w:rPr>
+          <m:t>Δ&gt;</m:t>
         </m:r>
         <m:sSub>
           <m:sSubPr>
@@ -8257,7 +8049,7 @@
           <m:e>
             <m:r>
               <m:rPr>
-                <m:sty m:val="b"/>
+                <m:sty m:val="p"/>
               </m:rPr>
               <w:rPr>
                 <w:rFonts w:ascii="Cambria Math" w:hAnsi="Cambria Math"/>
@@ -8276,27 +8068,9 @@
         </m:sSub>
       </m:oMath>
       <w:r>
-        <w:t xml:space="preserve"> (first-order algorithms cannot self-rewrite their own axioms). Human second-order self-reflection operator possesses second-order hyper-formal mapping </w:t>
-      </w:r>
-      <m:oMath>
-        <m:r>
-          <m:rPr>
-            <m:sty m:val="b"/>
-          </m:rPr>
-          <w:rPr>
-            <w:rFonts w:ascii="Cambria Math" w:hAnsi="Cambria Math"/>
-          </w:rPr>
-          <m:t>Φ</m:t>
-        </m:r>
-        <m:r>
-          <m:rPr>
-            <m:sty m:val="p"/>
-          </m:rPr>
-          <w:rPr>
-            <w:rFonts w:ascii="Cambria Math" w:hAnsi="Cambria Math"/>
-          </w:rPr>
-          <m:t>:Map(Ξ→</m:t>
-        </m:r>
+        <w:t xml:space="preserve"> (first-order algorithms cannot self-rewrite their own axioms). Second-Order Meta-Cognitive Constitutional Rewriting Operator </w:t>
+      </w:r>
+      <m:oMath>
         <m:sSub>
           <m:sSubPr>
             <m:ctrlPr>
@@ -8313,26 +8087,34 @@
               <w:rPr>
                 <w:rFonts w:ascii="Cambria Math" w:hAnsi="Cambria Math"/>
               </w:rPr>
-              <m:t>Ω</m:t>
+              <m:t>Φ</m:t>
             </m:r>
           </m:e>
           <m:sub>
             <m:r>
-              <w:rPr>
-                <w:rFonts w:ascii="Cambria Math" w:hAnsi="Cambria Math"/>
-              </w:rPr>
-              <m:t>k</m:t>
+              <m:rPr>
+                <m:sty m:val="p"/>
+              </m:rPr>
+              <w:rPr>
+                <w:rFonts w:ascii="Cambria Math" w:hAnsi="Cambria Math"/>
+              </w:rPr>
+              <m:t>Human</m:t>
             </m:r>
           </m:sub>
         </m:sSub>
-        <m:r>
-          <m:rPr>
-            <m:sty m:val="p"/>
-          </m:rPr>
-          <w:rPr>
-            <w:rFonts w:ascii="Cambria Math" w:hAnsi="Cambria Math"/>
-          </w:rPr>
-          <m:t>)→Map(Ξ→</m:t>
+      </m:oMath>
+      <w:r>
+        <w:t xml:space="preserve"> possesses second-order hyper-formal mapping </w:t>
+      </w:r>
+      <m:oMath>
+        <m:r>
+          <m:rPr>
+            <m:sty m:val="p"/>
+          </m:rPr>
+          <w:rPr>
+            <w:rFonts w:ascii="Cambria Math" w:hAnsi="Cambria Math"/>
+          </w:rPr>
+          <m:t>Φ:Map(Ξ→</m:t>
         </m:r>
         <m:sSub>
           <m:sSubPr>
@@ -8360,21 +8142,6 @@
               </w:rPr>
               <m:t>k</m:t>
             </m:r>
-            <m:r>
-              <m:rPr>
-                <m:sty m:val="p"/>
-              </m:rPr>
-              <w:rPr>
-                <w:rFonts w:ascii="Cambria Math" w:hAnsi="Cambria Math"/>
-              </w:rPr>
-              <m:t>+</m:t>
-            </m:r>
-            <m:r>
-              <w:rPr>
-                <w:rFonts w:ascii="Cambria Math" w:hAnsi="Cambria Math"/>
-              </w:rPr>
-              <m:t>1</m:t>
-            </m:r>
           </m:sub>
         </m:sSub>
         <m:r>
@@ -8384,13 +8151,8 @@
           <w:rPr>
             <w:rFonts w:ascii="Cambria Math" w:hAnsi="Cambria Math"/>
           </w:rPr>
-          <m:t>)</m:t>
-        </m:r>
-      </m:oMath>
-      <w:r>
-        <w:t xml:space="preserve">. Thus, human second-order self-reflection </w:t>
-      </w:r>
-      <m:oMath>
+          <m:t>)→Map(Ξ→</m:t>
+        </m:r>
         <m:sSub>
           <m:sSubPr>
             <m:ctrlPr>
@@ -8402,7 +8164,64 @@
           <m:e>
             <m:r>
               <m:rPr>
-                <m:sty m:val="b"/>
+                <m:sty m:val="p"/>
+              </m:rPr>
+              <w:rPr>
+                <w:rFonts w:ascii="Cambria Math" w:hAnsi="Cambria Math"/>
+              </w:rPr>
+              <m:t>Ω</m:t>
+            </m:r>
+          </m:e>
+          <m:sub>
+            <m:r>
+              <w:rPr>
+                <w:rFonts w:ascii="Cambria Math" w:hAnsi="Cambria Math"/>
+              </w:rPr>
+              <m:t>k</m:t>
+            </m:r>
+            <m:r>
+              <m:rPr>
+                <m:sty m:val="p"/>
+              </m:rPr>
+              <w:rPr>
+                <w:rFonts w:ascii="Cambria Math" w:hAnsi="Cambria Math"/>
+              </w:rPr>
+              <m:t>+</m:t>
+            </m:r>
+            <m:r>
+              <w:rPr>
+                <w:rFonts w:ascii="Cambria Math" w:hAnsi="Cambria Math"/>
+              </w:rPr>
+              <m:t>1</m:t>
+            </m:r>
+          </m:sub>
+        </m:sSub>
+        <m:r>
+          <m:rPr>
+            <m:sty m:val="p"/>
+          </m:rPr>
+          <w:rPr>
+            <w:rFonts w:ascii="Cambria Math" w:hAnsi="Cambria Math"/>
+          </w:rPr>
+          <m:t>)</m:t>
+        </m:r>
+      </m:oMath>
+      <w:r>
+        <w:t xml:space="preserve">. Thus, Second-Order Meta-Cognitive Constitutional Rewriting Operator </w:t>
+      </w:r>
+      <m:oMath>
+        <m:sSub>
+          <m:sSubPr>
+            <m:ctrlPr>
+              <w:rPr>
+                <w:rFonts w:ascii="Cambria Math" w:hAnsi="Cambria Math"/>
+              </w:rPr>
+            </m:ctrlPr>
+          </m:sSubPr>
+          <m:e>
+            <m:r>
+              <m:rPr>
+                <m:sty m:val="p"/>
               </m:rPr>
               <w:rPr>
                 <w:rFonts w:ascii="Cambria Math" w:hAnsi="Cambria Math"/>
@@ -8486,7 +8305,7 @@
       <m:oMath>
         <m:r>
           <m:rPr>
-            <m:sty m:val="b"/>
+            <m:sty m:val="p"/>
           </m:rPr>
           <w:rPr>
             <w:rFonts w:ascii="Cambria Math" w:hAnsi="Cambria Math"/>
@@ -8509,7 +8328,7 @@
           <m:e>
             <m:r>
               <m:rPr>
-                <m:sty m:val="b"/>
+                <m:sty m:val="p"/>
               </m:rPr>
               <w:rPr>
                 <w:rFonts w:ascii="Cambria Math" w:hAnsi="Cambria Math"/>
@@ -8632,21 +8451,7 @@
         </m:r>
       </m:oMath>
       <w:r>
-        <w:t xml:space="preserve">, </w:t>
-      </w:r>
-      <m:oMath>
-        <m:r>
-          <m:rPr>
-            <m:sty m:val="b"/>
-          </m:rPr>
-          <w:rPr>
-            <w:rFonts w:ascii="Cambria Math" w:hAnsi="Cambria Math"/>
-          </w:rPr>
-          <m:t>Φ</m:t>
-        </m:r>
-      </m:oMath>
-      <w:r>
-        <w:t xml:space="preserve"> second-order self-reflection, compliance support operator (Conscience Operator) </w:t>
+        <w:t xml:space="preserve">, Second-Order Meta-Cognitive Constitutional Rewriting Operator </w:t>
       </w:r>
       <m:oMath>
         <m:sSub>
@@ -8660,12 +8465,12 @@
           <m:e>
             <m:r>
               <m:rPr>
-                <m:sty m:val="bi"/>
-              </m:rPr>
-              <w:rPr>
-                <w:rFonts w:ascii="Cambria Math" w:hAnsi="Cambria Math"/>
-              </w:rPr>
-              <m:t>E</m:t>
+                <m:sty m:val="p"/>
+              </m:rPr>
+              <w:rPr>
+                <w:rFonts w:ascii="Cambria Math" w:hAnsi="Cambria Math"/>
+              </w:rPr>
+              <m:t>Φ</m:t>
             </m:r>
           </m:e>
           <m:sub>
@@ -8676,18 +8481,130 @@
               <w:rPr>
                 <w:rFonts w:ascii="Cambria Math" w:hAnsi="Cambria Math"/>
               </w:rPr>
-              <m:t>supp</m:t>
+              <m:t>Human</m:t>
             </m:r>
           </m:sub>
         </m:sSub>
       </m:oMath>
       <w:r>
-        <w:t xml:space="preserve"> redline), for physical value network OCGS, this paper supplies the Necessary condition for Metasynthetic Departments breaking Nash deadlocks and the Sufficient condition when coupled with rigid barriers; supplies the Sufficient condition for HWDS computability on restricted graphs; and supplies the Necessary condition for human second-order self-reflection and the Sufficient condition for work operator tensor products in human-machine combination.</w:t>
+        <w:t xml:space="preserve">, compliance support operator (Conscience Operator) </w:t>
+      </w:r>
+      <m:oMath>
+        <m:sSub>
+          <m:sSubPr>
+            <m:ctrlPr>
+              <w:rPr>
+                <w:rFonts w:ascii="Cambria Math" w:hAnsi="Cambria Math"/>
+              </w:rPr>
+            </m:ctrlPr>
+          </m:sSubPr>
+          <m:e>
+            <m:r>
+              <w:rPr>
+                <w:rFonts w:ascii="Cambria Math" w:hAnsi="Cambria Math"/>
+              </w:rPr>
+              <m:t>E</m:t>
+            </m:r>
+          </m:e>
+          <m:sub>
+            <m:r>
+              <m:rPr>
+                <m:nor/>
+              </m:rPr>
+              <m:t>supp</m:t>
+            </m:r>
+          </m:sub>
+        </m:sSub>
+      </m:oMath>
+      <w:r>
+        <w:t xml:space="preserve"> redline), for physical value network OCGS, this paper supplies the Necessary condition for the Overall Design Department to break Nash deadlocks and the Sufficient condition when coupled with rigid barriers; supplies the Sufficient condition for HWME closed-loop computability on restricted graphs; and supplies the Necessary </w:t>
+      </w:r>
+      <w:r>
+        <w:lastRenderedPageBreak/>
+        <w:t xml:space="preserve">condition for Second-Order Meta-Cognitive Constitutional Rewriting Operator </w:t>
+      </w:r>
+      <m:oMath>
+        <m:sSub>
+          <m:sSubPr>
+            <m:ctrlPr>
+              <w:rPr>
+                <w:rFonts w:ascii="Cambria Math" w:hAnsi="Cambria Math"/>
+              </w:rPr>
+            </m:ctrlPr>
+          </m:sSubPr>
+          <m:e>
+            <m:r>
+              <m:rPr>
+                <m:sty m:val="p"/>
+              </m:rPr>
+              <w:rPr>
+                <w:rFonts w:ascii="Cambria Math" w:hAnsi="Cambria Math"/>
+              </w:rPr>
+              <m:t>Φ</m:t>
+            </m:r>
+          </m:e>
+          <m:sub>
+            <m:r>
+              <m:rPr>
+                <m:sty m:val="p"/>
+              </m:rPr>
+              <w:rPr>
+                <w:rFonts w:ascii="Cambria Math" w:hAnsi="Cambria Math"/>
+              </w:rPr>
+              <m:t>Human</m:t>
+            </m:r>
+          </m:sub>
+        </m:sSub>
+      </m:oMath>
+      <w:r>
+        <w:t xml:space="preserve"> and the Sufficient condition for work operator tensor products in human-machine combination. Generalization to general OCGS requires reconstructing </w:t>
+      </w:r>
+      <m:oMath>
+        <m:r>
+          <m:rPr>
+            <m:sty m:val="p"/>
+          </m:rPr>
+          <w:rPr>
+            <w:rFonts w:ascii="Cambria Math" w:hAnsi="Cambria Math"/>
+          </w:rPr>
+          <m:t>Π</m:t>
+        </m:r>
+      </m:oMath>
+      <w:r>
+        <w:t xml:space="preserve">, matrix </w:t>
+      </w:r>
+      <m:oMath>
+        <m:r>
+          <m:rPr>
+            <m:sty m:val="bi"/>
+          </m:rPr>
+          <w:rPr>
+            <w:rFonts w:ascii="Cambria Math" w:hAnsi="Cambria Math"/>
+          </w:rPr>
+          <m:t>A</m:t>
+        </m:r>
+      </m:oMath>
+      <w:r>
+        <w:t xml:space="preserve">, operator </w:t>
+      </w:r>
+      <m:oMath>
+        <m:r>
+          <m:rPr>
+            <m:sty m:val="p"/>
+          </m:rPr>
+          <w:rPr>
+            <w:rFonts w:ascii="Cambria Math" w:hAnsi="Cambria Math"/>
+          </w:rPr>
+          <m:t>Φ</m:t>
+        </m:r>
+      </m:oMath>
+      <w:r>
+        <w:t>, and observation domains for specific domains.</w:t>
       </w:r>
     </w:p>
     <w:p>
       <w:r>
-        <w:pict w14:anchorId="210158B2">
+        <w:pict w14:anchorId="24BA39D0">
           <v:rect id="_x0000_i1029" style="width:0;height:1.5pt" o:hralign="center" o:hrstd="t" o:hr="t"/>
         </w:pict>
       </w:r>
@@ -8718,7 +8635,7 @@
         <w:t>“Human-out-of-the-loop, Human-machine collaboration” Division</w:t>
       </w:r>
       <w:r>
-        <w:t xml:space="preserve">: Humans manage second-order meta-control operators </w:t>
+        <w:t xml:space="preserve">: Humans manage Second-Order Meta-Cognitive Constitutional Rewriting Operator </w:t>
       </w:r>
       <m:oMath>
         <m:sSub>
@@ -8732,7 +8649,7 @@
           <m:e>
             <m:r>
               <m:rPr>
-                <m:sty m:val="b"/>
+                <m:sty m:val="p"/>
               </m:rPr>
               <w:rPr>
                 <w:rFonts w:ascii="Cambria Math" w:hAnsi="Cambria Math"/>
@@ -8767,9 +8684,6 @@
           </m:sSubPr>
           <m:e>
             <m:r>
-              <m:rPr>
-                <m:sty m:val="bi"/>
-              </m:rPr>
               <w:rPr>
                 <w:rFonts w:ascii="Cambria Math" w:hAnsi="Cambria Math"/>
               </w:rPr>
@@ -8779,11 +8693,8 @@
           <m:sub>
             <m:r>
               <m:rPr>
-                <m:sty m:val="p"/>
-              </m:rPr>
-              <w:rPr>
-                <w:rFonts w:ascii="Cambria Math" w:hAnsi="Cambria Math"/>
-              </w:rPr>
+                <m:nor/>
+              </m:rPr>
               <m:t>supp</m:t>
             </m:r>
           </m:sub>
@@ -8804,7 +8715,7 @@
           <m:e>
             <m:r>
               <m:rPr>
-                <m:sty m:val="b"/>
+                <m:sty m:val="p"/>
               </m:rPr>
               <w:rPr>
                 <w:rFonts w:ascii="Cambria Math" w:hAnsi="Cambria Math"/>
@@ -8833,7 +8744,14 @@
           <w:b/>
           <w:bCs/>
         </w:rPr>
-        <w:t>“Tripartite” Fusion Architecture Capabilities</w:t>
+        <w:t xml:space="preserve">“Tripartite” </w:t>
+      </w:r>
+      <w:r>
+        <w:rPr>
+          <w:b/>
+          <w:bCs/>
+        </w:rPr>
+        <w:t>Fusion Architecture Capabilities</w:t>
       </w:r>
       <w:r>
         <w:t xml:space="preserve">: - </w:t>
@@ -8846,11 +8764,7 @@
         <w:t>Business Decoding Capability</w:t>
       </w:r>
       <w:r>
-        <w:t xml:space="preserve">: </w:t>
-      </w:r>
-      <w:r>
-        <w:lastRenderedPageBreak/>
-        <w:t xml:space="preserve">Penetrating organizational silos to parse fine-grained strongly coupled causal topologies of physical entities; - </w:t>
+        <w:t xml:space="preserve">: Penetrating organizational silos to parse fine-grained strongly coupled causal topologies of physical entities; - </w:t>
       </w:r>
       <w:r>
         <w:rPr>
@@ -8880,18 +8794,15 @@
         <w:t>Delivery Sovereignty’s “Medical School Model”</w:t>
       </w:r>
       <w:r>
-        <w:t>: Departing from traditional sell-and-fo</w:t>
-      </w:r>
-      <w:r>
-        <w:t xml:space="preserve">rget software packages or black-box subscriptions, the </w:t>
-      </w:r>
-      <w:r>
-        <w:t>“Medical School Model” supplies Open-Box source code delivery, dual team cultivation (business + algorithms), and long-term self-healing sovereignty, empowering enterprises to build self-sustaining anti-entropy capacities.</w:t>
+        <w:t>: Departing from traditional sell-and-forget software pac</w:t>
+      </w:r>
+      <w:r>
+        <w:t>kages or black-box subscriptions, the “Medical School Model” supplies Open-Box source code delivery, dual team cultivation (business + algorithms), and long-term self-healing sovereignty, empowering enterprises to build self-sustaining anti-entropy capacities.</w:t>
       </w:r>
     </w:p>
     <w:p>
       <w:r>
-        <w:pict w14:anchorId="4BB47729">
+        <w:pict w14:anchorId="1748A38D">
           <v:rect id="_x0000_i1030" style="width:0;height:1.5pt" o:hralign="center" o:hrstd="t" o:hr="t"/>
         </w:pict>
       </w:r>
@@ -8922,15 +8833,52 @@
         <w:pStyle w:val="a0"/>
       </w:pPr>
       <w:r>
-        <w:t>The core theoretical breakthrough of this paper lies in supplying formal mathematical proofs for Qian Xuesen’s three core OCGS principles (Necessary condition for Metasynthetic Departments breaking Nash deadlocks and Sufficient condition when coupled with rigid barriers; Sufficient condition for HWDS computability on restricted graphs; Necessary condition for human second-order self-reflection and Sufficient condition for work operator tensor products in human-machine combination) in entity discrete manufac</w:t>
-      </w:r>
-      <w:r>
-        <w:t>turing value networks featuring causal DAG structures, bypassing Wolfram computational irreducibility hurdles under restricted structures. Constructing physical “Plan-Execute-Feedback” self-healing closed loops is the effective path for eliminating internal vector cancellation and elevating ROIC.</w:t>
+        <w:t>The core theoretical breakthrough of this paper lies in supplying formal mathematical proofs for Qian Xuesen’s three core OCGS principles (Necessary condition for the Overall Design Department to break Nash deadlocks and Sufficient condition when coupled with rigid barriers; Sufficient condition for HWME closed-loop computability on restricted graphs; Necessary condition for Second-</w:t>
+      </w:r>
+      <w:r>
+        <w:lastRenderedPageBreak/>
+        <w:t xml:space="preserve">Order Meta-Cognitive Constitutional Rewriting Operator </w:t>
+      </w:r>
+      <m:oMath>
+        <m:sSub>
+          <m:sSubPr>
+            <m:ctrlPr>
+              <w:rPr>
+                <w:rFonts w:ascii="Cambria Math" w:hAnsi="Cambria Math"/>
+              </w:rPr>
+            </m:ctrlPr>
+          </m:sSubPr>
+          <m:e>
+            <m:r>
+              <m:rPr>
+                <m:sty m:val="p"/>
+              </m:rPr>
+              <w:rPr>
+                <w:rFonts w:ascii="Cambria Math" w:hAnsi="Cambria Math"/>
+              </w:rPr>
+              <m:t>Φ</m:t>
+            </m:r>
+          </m:e>
+          <m:sub>
+            <m:r>
+              <m:rPr>
+                <m:sty m:val="p"/>
+              </m:rPr>
+              <w:rPr>
+                <w:rFonts w:ascii="Cambria Math" w:hAnsi="Cambria Math"/>
+              </w:rPr>
+              <m:t>Human</m:t>
+            </m:r>
+          </m:sub>
+        </m:sSub>
+      </m:oMath>
+      <w:r>
+        <w:t xml:space="preserve"> and Sufficient condition for work operator tensor products in human-machine combination) in an entity discrete manufacturing value network as a class of OCGS featuring causal characteristic line orthogonal pruning, bypassing Wolfram computational irreducibility hurdles under restricted structures. Constructing physical “Plan-Execute-Feedback” self-healing closed loops is the effective path for eliminating internal vector cancellation and elevating ROIC.</w:t>
       </w:r>
     </w:p>
     <w:p>
       <w:r>
-        <w:pict w14:anchorId="654C3935">
+        <w:pict w14:anchorId="58B71A88">
           <v:rect id="_x0000_i1031" style="width:0;height:1.5pt" o:hralign="center" o:hrstd="t" o:hr="t"/>
         </w:pict>
       </w:r>
@@ -9057,7 +9005,6 @@
         </w:numPr>
       </w:pPr>
       <w:r>
-        <w:lastRenderedPageBreak/>
         <w:t xml:space="preserve">Meng, F. (2026). </w:t>
       </w:r>
       <w:r>
@@ -9278,6 +9225,7 @@
         </w:numPr>
       </w:pPr>
       <w:r>
+        <w:lastRenderedPageBreak/>
         <w:t xml:space="preserve">Miller, G. A. (1956). The magical number seven, plus or minus two: Some limits on our capacity for processing information. </w:t>
       </w:r>
       <w:r>
@@ -9516,7 +9464,7 @@
   <w:abstractNum w:abstractNumId="0" w15:restartNumberingAfterBreak="0">
     <w:nsid w:val="0000A990"/>
     <w:multiLevelType w:val="multilevel"/>
-    <w:tmpl w:val="99860FBA"/>
+    <w:tmpl w:val="D2BE701E"/>
     <w:lvl w:ilvl="0">
       <w:numFmt w:val="bullet"/>
       <w:lvlText w:val=" "/>
@@ -9593,7 +9541,7 @@
   <w:abstractNum w:abstractNumId="1" w15:restartNumberingAfterBreak="0">
     <w:nsid w:val="0000A991"/>
     <w:multiLevelType w:val="multilevel"/>
-    <w:tmpl w:val="2E280E7C"/>
+    <w:tmpl w:val="53FC66DA"/>
     <w:lvl w:ilvl="0">
       <w:numFmt w:val="bullet"/>
       <w:lvlText w:val=""/>
@@ -9697,7 +9645,7 @@
   <w:abstractNum w:abstractNumId="2" w15:restartNumberingAfterBreak="0">
     <w:nsid w:val="00A99411"/>
     <w:multiLevelType w:val="multilevel"/>
-    <w:tmpl w:val="E932CA8A"/>
+    <w:tmpl w:val="05A01134"/>
     <w:lvl w:ilvl="0">
       <w:start w:val="1"/>
       <w:numFmt w:val="decimal"/>
@@ -9780,16 +9728,16 @@
       </w:pPr>
     </w:lvl>
   </w:abstractNum>
-  <w:num w:numId="1" w16cid:durableId="543102680">
+  <w:num w:numId="1" w16cid:durableId="657195496">
     <w:abstractNumId w:val="0"/>
   </w:num>
-  <w:num w:numId="2" w16cid:durableId="1496646528">
+  <w:num w:numId="2" w16cid:durableId="570851029">
     <w:abstractNumId w:val="1"/>
   </w:num>
-  <w:num w:numId="3" w16cid:durableId="1705207046">
+  <w:num w:numId="3" w16cid:durableId="1560901737">
     <w:abstractNumId w:val="1"/>
   </w:num>
-  <w:num w:numId="4" w16cid:durableId="1539779708">
+  <w:num w:numId="4" w16cid:durableId="1701739104">
     <w:abstractNumId w:val="2"/>
     <w:lvlOverride w:ilvl="0">
       <w:startOverride w:val="1"/>
@@ -9819,13 +9767,13 @@
       <w:startOverride w:val="1"/>
     </w:lvlOverride>
   </w:num>
-  <w:num w:numId="5" w16cid:durableId="1830905020">
+  <w:num w:numId="5" w16cid:durableId="100956420">
     <w:abstractNumId w:val="1"/>
   </w:num>
-  <w:num w:numId="6" w16cid:durableId="1009060530">
+  <w:num w:numId="6" w16cid:durableId="1020009266">
     <w:abstractNumId w:val="1"/>
   </w:num>
-  <w:num w:numId="7" w16cid:durableId="465049960">
+  <w:num w:numId="7" w16cid:durableId="430199098">
     <w:abstractNumId w:val="2"/>
     <w:lvlOverride w:ilvl="0">
       <w:startOverride w:val="1"/>
@@ -9855,7 +9803,7 @@
       <w:startOverride w:val="1"/>
     </w:lvlOverride>
   </w:num>
-  <w:num w:numId="8" w16cid:durableId="2086296909">
+  <w:num w:numId="8" w16cid:durableId="421530930">
     <w:abstractNumId w:val="1"/>
   </w:num>
 </w:numbering>
@@ -11091,7 +11039,7 @@
     <w:name w:val="header"/>
     <w:basedOn w:val="a"/>
     <w:link w:val="af1"/>
-    <w:rsid w:val="002F78AF"/>
+    <w:rsid w:val="00036DFE"/>
     <w:pPr>
       <w:tabs>
         <w:tab w:val="center" w:pos="4153"/>
@@ -11109,7 +11057,7 @@
     <w:name w:val="页眉 字符"/>
     <w:basedOn w:val="a1"/>
     <w:link w:val="af0"/>
-    <w:rsid w:val="002F78AF"/>
+    <w:rsid w:val="00036DFE"/>
     <w:rPr>
       <w:sz w:val="18"/>
       <w:szCs w:val="18"/>
@@ -11119,7 +11067,7 @@
     <w:name w:val="footer"/>
     <w:basedOn w:val="a"/>
     <w:link w:val="af3"/>
-    <w:rsid w:val="002F78AF"/>
+    <w:rsid w:val="00036DFE"/>
     <w:pPr>
       <w:tabs>
         <w:tab w:val="center" w:pos="4153"/>
@@ -11136,7 +11084,7 @@
     <w:name w:val="页脚 字符"/>
     <w:basedOn w:val="a1"/>
     <w:link w:val="af2"/>
-    <w:rsid w:val="002F78AF"/>
+    <w:rsid w:val="00036DFE"/>
     <w:rPr>
       <w:sz w:val="18"/>
       <w:szCs w:val="18"/>
@@ -11145,7 +11093,7 @@
   <w:style w:type="character" w:styleId="af4">
     <w:name w:val="page number"/>
     <w:basedOn w:val="a1"/>
-    <w:rsid w:val="002F78AF"/>
+    <w:rsid w:val="00036DFE"/>
   </w:style>
 </w:styles>
 </file>

</xml_diff>